<commit_message>
ooxml-epic-a-xq9.10 repair SDK-invalid calibration fixtures; code-first, batch-verify pending
</commit_message>
<xml_diff>
--- a/testdata/docx/apply-styles/document.docx
+++ b/testdata/docx/apply-styles/document.docx
@@ -19,6 +19,11 @@
       </w:r>
     </w:p>
     <w:tbl>
+      <w:tblPr/>
+      <w:tblGrid>
+        <w:gridCol/>
+        <w:gridCol/>
+      </w:tblGrid>
       <w:tr>
         <w:tc>
           <w:p>

</xml_diff>